<commit_message>
fixed docx explanation file
</commit_message>
<xml_diff>
--- a/blackout-info.docx
+++ b/blackout-info.docx
@@ -1,6 +1,6 @@
 
 <file path=word/document.xml><?xml version="1.0" encoding="utf-8"?>
-<w:document xmlns:wpc="http://schemas.microsoft.com/office/word/2010/wordprocessingCanvas" xmlns:cx="http://schemas.microsoft.com/office/drawing/2014/chartex" xmlns:cx1="http://schemas.microsoft.com/office/drawing/2015/9/8/chartex" xmlns:cx2="http://schemas.microsoft.com/office/drawing/2015/10/21/chartex" xmlns:cx3="http://schemas.microsoft.com/office/drawing/2016/5/9/chartex" xmlns:cx4="http://schemas.microsoft.com/office/drawing/2016/5/10/chartex" xmlns:cx5="http://schemas.microsoft.com/office/drawing/2016/5/11/chartex" xmlns:cx6="http://schemas.microsoft.com/office/drawing/2016/5/12/chartex" xmlns:cx7="http://schemas.microsoft.com/office/drawing/2016/5/13/chartex" xmlns:cx8="http://schemas.microsoft.com/office/drawing/2016/5/14/chartex" xmlns:mc="http://schemas.openxmlformats.org/markup-compatibility/2006" xmlns:aink="http://schemas.microsoft.com/office/drawing/2016/ink" xmlns:am3d="http://schemas.microsoft.com/office/drawing/2017/model3d" xmlns:o="urn:schemas-microsoft-com:office:office" xmlns:oel="http://schemas.microsoft.com/office/2019/extlst" xmlns:r="http://schemas.openxmlformats.org/officeDocument/2006/relationships" xmlns:m="http://schemas.openxmlformats.org/officeDocument/2006/math" xmlns:v="urn:schemas-microsoft-com:vml" xmlns:wp14="http://schemas.microsoft.com/office/word/2010/wordprocessingDrawing" xmlns:wp="http://schemas.openxmlformats.org/drawingml/2006/wordprocessingDrawing" xmlns:w10="urn:schemas-microsoft-com:office:word" xmlns:w="http://schemas.openxmlformats.org/wordprocessingml/2006/main" xmlns:w14="http://schemas.microsoft.com/office/word/2010/wordml" xmlns:w15="http://schemas.microsoft.com/office/word/2012/wordml" xmlns:w16cex="http://schemas.microsoft.com/office/word/2018/wordml/cex" xmlns:w16cid="http://schemas.microsoft.com/office/word/2016/wordml/cid" xmlns:w16="http://schemas.microsoft.com/office/word/2018/wordml" xmlns:w16du="http://schemas.microsoft.com/office/word/2023/wordml/word16du" xmlns:w16sdtdh="http://schemas.microsoft.com/office/word/2020/wordml/sdtdatahash" xmlns:w16se="http://schemas.microsoft.com/office/word/2015/wordml/symex" xmlns:wpg="http://schemas.microsoft.com/office/word/2010/wordprocessingGroup" xmlns:wpi="http://schemas.microsoft.com/office/word/2010/wordprocessingInk" xmlns:wne="http://schemas.microsoft.com/office/word/2006/wordml" xmlns:wps="http://schemas.microsoft.com/office/word/2010/wordprocessingShape" mc:Ignorable="w14 w15 w16se w16cid w16 w16cex w16sdtdh w16du wp14">
+<w:document xmlns:wpc="http://schemas.microsoft.com/office/word/2010/wordprocessingCanvas" xmlns:mc="http://schemas.openxmlformats.org/markup-compatibility/2006" xmlns:o="urn:schemas-microsoft-com:office:office" xmlns:r="http://schemas.openxmlformats.org/officeDocument/2006/relationships" xmlns:m="http://schemas.openxmlformats.org/officeDocument/2006/math" xmlns:v="urn:schemas-microsoft-com:vml" xmlns:wp14="http://schemas.microsoft.com/office/word/2010/wordprocessingDrawing" xmlns:wp="http://schemas.openxmlformats.org/drawingml/2006/wordprocessingDrawing" xmlns:w10="urn:schemas-microsoft-com:office:word" xmlns:w="http://schemas.openxmlformats.org/wordprocessingml/2006/main" xmlns:w14="http://schemas.microsoft.com/office/word/2010/wordml" xmlns:w15="http://schemas.microsoft.com/office/word/2012/wordml" xmlns:wpg="http://schemas.microsoft.com/office/word/2010/wordprocessingGroup" xmlns:wpi="http://schemas.microsoft.com/office/word/2010/wordprocessingInk" xmlns:wne="http://schemas.microsoft.com/office/word/2006/wordml" xmlns:wps="http://schemas.microsoft.com/office/word/2010/wordprocessingShape" mc:Ignorable="w14 w15 wp14">
   <w:body>
     <w:p>
       <w:pPr>
@@ -157,8 +157,14 @@
           <w:ilvl w:val="1"/>
           <w:numId w:val="1"/>
         </w:numPr>
-      </w:pPr>
-      <w:r>
+        <w:rPr>
+          <w:lang w:val="de-DE"/>
+        </w:rPr>
+      </w:pPr>
+      <w:r>
+        <w:rPr>
+          <w:lang w:val="de-DE"/>
+        </w:rPr>
         <w:t>Generisanje koktela na osnovu sastojaka koje korisnik ima</w:t>
       </w:r>
     </w:p>
@@ -169,12 +175,24 @@
           <w:ilvl w:val="1"/>
           <w:numId w:val="1"/>
         </w:numPr>
-      </w:pPr>
-      <w:r>
+        <w:rPr>
+          <w:lang w:val="de-DE"/>
+        </w:rPr>
+      </w:pPr>
+      <w:r>
+        <w:rPr>
+          <w:lang w:val="de-DE"/>
+        </w:rPr>
         <w:t>Mozda da user moze da doda recept</w:t>
       </w:r>
     </w:p>
-    <w:p/>
+    <w:p>
+      <w:pPr>
+        <w:rPr>
+          <w:lang w:val="de-DE"/>
+        </w:rPr>
+      </w:pPr>
+    </w:p>
     <w:p>
       <w:pPr>
         <w:pStyle w:val="ListParagraph"/>
@@ -313,8 +331,14 @@
           <w:ilvl w:val="1"/>
           <w:numId w:val="1"/>
         </w:numPr>
-      </w:pPr>
-      <w:r>
+        <w:rPr>
+          <w:lang w:val="de-DE"/>
+        </w:rPr>
+      </w:pPr>
+      <w:r>
+        <w:rPr>
+          <w:lang w:val="de-DE"/>
+        </w:rPr>
         <w:t>Mozda da moze kod sebe da edituje recept / zapise svoj</w:t>
       </w:r>
     </w:p>
@@ -481,7 +505,6 @@
           <w:sz w:val="32"/>
           <w:szCs w:val="32"/>
         </w:rPr>
-        <w:lastRenderedPageBreak/>
         <w:t>Upload fajlova</w:t>
       </w:r>
     </w:p>
@@ -630,19 +653,7 @@
         </w:numPr>
       </w:pPr>
       <w:r>
-        <w:t>Koliko je sladak</w:t>
-      </w:r>
-    </w:p>
-    <w:p>
-      <w:pPr>
-        <w:pStyle w:val="ListParagraph"/>
-        <w:numPr>
-          <w:ilvl w:val="1"/>
-          <w:numId w:val="1"/>
-        </w:numPr>
-      </w:pPr>
-      <w:r>
-        <w:t>Koliko je gorak</w:t>
+        <w:t>Propratni komentar uz ocjenu</w:t>
       </w:r>
     </w:p>
     <w:p>
@@ -1234,145 +1245,165 @@
           <w:sz w:val="26"/>
           <w:szCs w:val="26"/>
         </w:rPr>
+        <w:t>Foreign key (cocktail_id) references Cocktail (id)</w:t>
+      </w:r>
+    </w:p>
+    <w:p>
+      <w:pPr>
+        <w:pStyle w:val="ListParagraph"/>
+        <w:ind w:left="1440"/>
+        <w:rPr>
+          <w:sz w:val="26"/>
+          <w:szCs w:val="26"/>
+        </w:rPr>
+      </w:pPr>
+      <w:r>
+        <w:rPr>
+          <w:sz w:val="26"/>
+          <w:szCs w:val="26"/>
+        </w:rPr>
+        <w:t>Unique (user_id, cocktail_id)</w:t>
+      </w:r>
+    </w:p>
+    <w:p>
+      <w:pPr>
+        <w:pStyle w:val="ListParagraph"/>
+        <w:numPr>
+          <w:ilvl w:val="1"/>
+          <w:numId w:val="1"/>
+        </w:numPr>
+        <w:rPr>
+          <w:b/>
+          <w:bCs/>
+          <w:sz w:val="26"/>
+          <w:szCs w:val="26"/>
+        </w:rPr>
+      </w:pPr>
+      <w:r>
+        <w:rPr>
+          <w:b/>
+          <w:bCs/>
+          <w:sz w:val="26"/>
+          <w:szCs w:val="26"/>
+        </w:rPr>
+        <w:t xml:space="preserve">Review </w:t>
+      </w:r>
+      <w:r>
+        <w:rPr>
+          <w:color w:val="156082" w:themeColor="accent1"/>
+        </w:rPr>
+        <w:t>Rating / Comment</w:t>
+      </w:r>
+      <w:r>
+        <w:rPr>
+          <w:b/>
+          <w:bCs/>
+        </w:rPr>
+        <w:t xml:space="preserve"> </w:t>
+      </w:r>
+      <w:r>
+        <w:rPr>
+          <w:b/>
+          <w:bCs/>
+          <w:sz w:val="26"/>
+          <w:szCs w:val="26"/>
+        </w:rPr>
+        <w:t>(id, text, rate</w:t>
+      </w:r>
+      <w:r>
+        <w:rPr>
+          <w:b/>
+          <w:bCs/>
+          <w:sz w:val="26"/>
+          <w:szCs w:val="26"/>
+        </w:rPr>
+        <w:t xml:space="preserve">, </w:t>
+      </w:r>
+      <w:bookmarkStart w:id="0" w:name="_GoBack"/>
+      <w:bookmarkEnd w:id="0"/>
+      <w:r>
+        <w:rPr>
+          <w:b/>
+          <w:bCs/>
+          <w:sz w:val="26"/>
+          <w:szCs w:val="26"/>
+        </w:rPr>
+        <w:t>user_id, cocktail_id, created_at)</w:t>
+      </w:r>
+    </w:p>
+    <w:p>
+      <w:pPr>
+        <w:pStyle w:val="ListParagraph"/>
+        <w:ind w:left="1440"/>
+        <w:rPr>
+          <w:sz w:val="26"/>
+          <w:szCs w:val="26"/>
+        </w:rPr>
+      </w:pPr>
+      <w:r>
+        <w:rPr>
+          <w:sz w:val="26"/>
+          <w:szCs w:val="26"/>
+        </w:rPr>
+        <w:t>Primary key (id)</w:t>
+      </w:r>
+    </w:p>
+    <w:p>
+      <w:pPr>
+        <w:pStyle w:val="ListParagraph"/>
+        <w:ind w:left="1440"/>
+        <w:rPr>
+          <w:sz w:val="26"/>
+          <w:szCs w:val="26"/>
+        </w:rPr>
+      </w:pPr>
+      <w:r>
+        <w:rPr>
+          <w:sz w:val="26"/>
+          <w:szCs w:val="26"/>
+        </w:rPr>
+        <w:t>Foreign key (user_id) references User (id)</w:t>
+      </w:r>
+    </w:p>
+    <w:p>
+      <w:pPr>
+        <w:pStyle w:val="ListParagraph"/>
+        <w:ind w:left="1440"/>
+        <w:rPr>
+          <w:sz w:val="26"/>
+          <w:szCs w:val="26"/>
+        </w:rPr>
+      </w:pPr>
+      <w:r>
+        <w:rPr>
+          <w:sz w:val="26"/>
+          <w:szCs w:val="26"/>
+        </w:rPr>
+        <w:t>Foreign key (cocktail_id) references Cocktail (id)</w:t>
+      </w:r>
+    </w:p>
+    <w:p>
+      <w:pPr>
+        <w:pStyle w:val="ListParagraph"/>
+        <w:numPr>
+          <w:ilvl w:val="1"/>
+          <w:numId w:val="1"/>
+        </w:numPr>
+        <w:rPr>
+          <w:b/>
+          <w:bCs/>
+          <w:sz w:val="26"/>
+          <w:szCs w:val="26"/>
+        </w:rPr>
+      </w:pPr>
+      <w:r>
+        <w:rPr>
+          <w:b/>
+          <w:bCs/>
+          <w:sz w:val="26"/>
+          <w:szCs w:val="26"/>
+        </w:rPr>
         <w:lastRenderedPageBreak/>
-        <w:t>Foreign key (cocktail_id) references Cocktail (id)</w:t>
-      </w:r>
-    </w:p>
-    <w:p>
-      <w:pPr>
-        <w:pStyle w:val="ListParagraph"/>
-        <w:ind w:left="1440"/>
-        <w:rPr>
-          <w:sz w:val="26"/>
-          <w:szCs w:val="26"/>
-        </w:rPr>
-      </w:pPr>
-      <w:r>
-        <w:rPr>
-          <w:sz w:val="26"/>
-          <w:szCs w:val="26"/>
-        </w:rPr>
-        <w:t>Unique (user_id, cocktail_id)</w:t>
-      </w:r>
-    </w:p>
-    <w:p>
-      <w:pPr>
-        <w:pStyle w:val="ListParagraph"/>
-        <w:numPr>
-          <w:ilvl w:val="1"/>
-          <w:numId w:val="1"/>
-        </w:numPr>
-        <w:rPr>
-          <w:b/>
-          <w:bCs/>
-          <w:sz w:val="26"/>
-          <w:szCs w:val="26"/>
-        </w:rPr>
-      </w:pPr>
-      <w:r>
-        <w:rPr>
-          <w:b/>
-          <w:bCs/>
-          <w:sz w:val="26"/>
-          <w:szCs w:val="26"/>
-        </w:rPr>
-        <w:t xml:space="preserve">Review </w:t>
-      </w:r>
-      <w:r>
-        <w:rPr>
-          <w:color w:val="156082" w:themeColor="accent1"/>
-        </w:rPr>
-        <w:t>Rating / Comment</w:t>
-      </w:r>
-      <w:r>
-        <w:rPr>
-          <w:b/>
-          <w:bCs/>
-        </w:rPr>
-        <w:t xml:space="preserve"> </w:t>
-      </w:r>
-      <w:r>
-        <w:rPr>
-          <w:b/>
-          <w:bCs/>
-          <w:sz w:val="26"/>
-          <w:szCs w:val="26"/>
-        </w:rPr>
-        <w:t>(id, text, rate, sweet_rate, bitter_rate, user_id, cocktail_id, created_at)</w:t>
-      </w:r>
-    </w:p>
-    <w:p>
-      <w:pPr>
-        <w:pStyle w:val="ListParagraph"/>
-        <w:ind w:left="1440"/>
-        <w:rPr>
-          <w:sz w:val="26"/>
-          <w:szCs w:val="26"/>
-        </w:rPr>
-      </w:pPr>
-      <w:r>
-        <w:rPr>
-          <w:sz w:val="26"/>
-          <w:szCs w:val="26"/>
-        </w:rPr>
-        <w:t>Primary key (id)</w:t>
-      </w:r>
-    </w:p>
-    <w:p>
-      <w:pPr>
-        <w:pStyle w:val="ListParagraph"/>
-        <w:ind w:left="1440"/>
-        <w:rPr>
-          <w:sz w:val="26"/>
-          <w:szCs w:val="26"/>
-        </w:rPr>
-      </w:pPr>
-      <w:r>
-        <w:rPr>
-          <w:sz w:val="26"/>
-          <w:szCs w:val="26"/>
-        </w:rPr>
-        <w:t>Foreign key (user_id) references User (id)</w:t>
-      </w:r>
-    </w:p>
-    <w:p>
-      <w:pPr>
-        <w:pStyle w:val="ListParagraph"/>
-        <w:ind w:left="1440"/>
-        <w:rPr>
-          <w:sz w:val="26"/>
-          <w:szCs w:val="26"/>
-        </w:rPr>
-      </w:pPr>
-      <w:r>
-        <w:rPr>
-          <w:sz w:val="26"/>
-          <w:szCs w:val="26"/>
-        </w:rPr>
-        <w:t>Foreign key (cocktail_id) references Cocktail (id)</w:t>
-      </w:r>
-    </w:p>
-    <w:p>
-      <w:pPr>
-        <w:pStyle w:val="ListParagraph"/>
-        <w:numPr>
-          <w:ilvl w:val="1"/>
-          <w:numId w:val="1"/>
-        </w:numPr>
-        <w:rPr>
-          <w:b/>
-          <w:bCs/>
-          <w:sz w:val="26"/>
-          <w:szCs w:val="26"/>
-        </w:rPr>
-      </w:pPr>
-      <w:r>
-        <w:rPr>
-          <w:b/>
-          <w:bCs/>
-          <w:sz w:val="26"/>
-          <w:szCs w:val="26"/>
-        </w:rPr>
         <w:t>RecipeVersion (id, cocktail_id, user_id, name, description, created_at)</w:t>
       </w:r>
     </w:p>
@@ -1628,81 +1659,6 @@
     </w:p>
     <w:p>
       <w:pPr>
-        <w:pStyle w:val="ListParagraph"/>
-        <w:numPr>
-          <w:ilvl w:val="1"/>
-          <w:numId w:val="1"/>
-        </w:numPr>
-        <w:rPr>
-          <w:b/>
-          <w:bCs/>
-          <w:sz w:val="26"/>
-          <w:szCs w:val="26"/>
-        </w:rPr>
-      </w:pPr>
-      <w:r>
-        <w:rPr>
-          <w:b/>
-          <w:bCs/>
-          <w:sz w:val="26"/>
-          <w:szCs w:val="26"/>
-        </w:rPr>
-        <w:t>StepIngredient (step_id, ingredient_id)</w:t>
-      </w:r>
-    </w:p>
-    <w:p>
-      <w:pPr>
-        <w:pStyle w:val="ListParagraph"/>
-        <w:ind w:left="1440"/>
-        <w:rPr>
-          <w:sz w:val="26"/>
-          <w:szCs w:val="26"/>
-        </w:rPr>
-      </w:pPr>
-      <w:r>
-        <w:rPr>
-          <w:sz w:val="26"/>
-          <w:szCs w:val="26"/>
-        </w:rPr>
-        <w:t>Primary key (step_id, ingredient_id)</w:t>
-      </w:r>
-    </w:p>
-    <w:p>
-      <w:pPr>
-        <w:pStyle w:val="ListParagraph"/>
-        <w:ind w:left="1440"/>
-        <w:rPr>
-          <w:sz w:val="26"/>
-          <w:szCs w:val="26"/>
-        </w:rPr>
-      </w:pPr>
-      <w:r>
-        <w:rPr>
-          <w:sz w:val="26"/>
-          <w:szCs w:val="26"/>
-        </w:rPr>
-        <w:t>Foreign key (step_id) references Step (id)</w:t>
-      </w:r>
-    </w:p>
-    <w:p>
-      <w:pPr>
-        <w:pStyle w:val="ListParagraph"/>
-        <w:ind w:left="1440"/>
-        <w:rPr>
-          <w:sz w:val="26"/>
-          <w:szCs w:val="26"/>
-        </w:rPr>
-      </w:pPr>
-      <w:r>
-        <w:rPr>
-          <w:sz w:val="26"/>
-          <w:szCs w:val="26"/>
-        </w:rPr>
-        <w:t>Foreign key (ingredient_id) references Ingredient (id)</w:t>
-      </w:r>
-    </w:p>
-    <w:p>
-      <w:pPr>
         <w:rPr>
           <w:sz w:val="26"/>
           <w:szCs w:val="26"/>
@@ -1714,10 +1670,10 @@
         </w:rPr>
         <w:lastRenderedPageBreak/>
         <w:drawing>
-          <wp:inline distT="0" distB="0" distL="0" distR="0" wp14:anchorId="71D8527F" wp14:editId="5DDCCE76">
-            <wp:extent cx="6750685" cy="8216900"/>
-            <wp:effectExtent l="0" t="0" r="0" b="0"/>
-            <wp:docPr id="842768370" name="Picture 1" descr="A diagram of a flowchart&#10;&#10;Description automatically generated"/>
+          <wp:inline distT="0" distB="0" distL="0" distR="0" wp14:anchorId="15046226" wp14:editId="08DBF5A8">
+            <wp:extent cx="6750685" cy="8207720"/>
+            <wp:effectExtent l="0" t="0" r="0" b="3175"/>
+            <wp:docPr id="1" name="Picture 1" descr="C:\Users\Korisnik\Desktop\CocktailMakerDB-Stranica-1.drawio.png"/>
             <wp:cNvGraphicFramePr>
               <a:graphicFrameLocks xmlns:a="http://schemas.openxmlformats.org/drawingml/2006/main" noChangeAspect="1"/>
             </wp:cNvGraphicFramePr>
@@ -1725,7 +1681,7 @@
               <a:graphicData uri="http://schemas.openxmlformats.org/drawingml/2006/picture">
                 <pic:pic xmlns:pic="http://schemas.openxmlformats.org/drawingml/2006/picture">
                   <pic:nvPicPr>
-                    <pic:cNvPr id="842768370" name="Picture 1" descr="A diagram of a flowchart&#10;&#10;Description automatically generated"/>
+                    <pic:cNvPr id="0" name="Picture 1" descr="C:\Users\Korisnik\Desktop\CocktailMakerDB-Stranica-1.drawio.png"/>
                     <pic:cNvPicPr>
                       <a:picLocks noChangeAspect="1" noChangeArrowheads="1"/>
                     </pic:cNvPicPr>
@@ -1746,7 +1702,7 @@
                   <pic:spPr bwMode="auto">
                     <a:xfrm>
                       <a:off x="0" y="0"/>
-                      <a:ext cx="6750685" cy="8216900"/>
+                      <a:ext cx="6750685" cy="8207720"/>
                     </a:xfrm>
                     <a:prstGeom prst="rect">
                       <a:avLst/>
@@ -1774,7 +1730,7 @@
 </file>
 
 <file path=word/numbering.xml><?xml version="1.0" encoding="utf-8"?>
-<w:numbering xmlns:wpc="http://schemas.microsoft.com/office/word/2010/wordprocessingCanvas" xmlns:cx="http://schemas.microsoft.com/office/drawing/2014/chartex" xmlns:cx1="http://schemas.microsoft.com/office/drawing/2015/9/8/chartex" xmlns:cx2="http://schemas.microsoft.com/office/drawing/2015/10/21/chartex" xmlns:cx3="http://schemas.microsoft.com/office/drawing/2016/5/9/chartex" xmlns:cx4="http://schemas.microsoft.com/office/drawing/2016/5/10/chartex" xmlns:cx5="http://schemas.microsoft.com/office/drawing/2016/5/11/chartex" xmlns:cx6="http://schemas.microsoft.com/office/drawing/2016/5/12/chartex" xmlns:cx7="http://schemas.microsoft.com/office/drawing/2016/5/13/chartex" xmlns:cx8="http://schemas.microsoft.com/office/drawing/2016/5/14/chartex" xmlns:mc="http://schemas.openxmlformats.org/markup-compatibility/2006" xmlns:aink="http://schemas.microsoft.com/office/drawing/2016/ink" xmlns:am3d="http://schemas.microsoft.com/office/drawing/2017/model3d" xmlns:o="urn:schemas-microsoft-com:office:office" xmlns:oel="http://schemas.microsoft.com/office/2019/extlst" xmlns:r="http://schemas.openxmlformats.org/officeDocument/2006/relationships" xmlns:m="http://schemas.openxmlformats.org/officeDocument/2006/math" xmlns:v="urn:schemas-microsoft-com:vml" xmlns:wp14="http://schemas.microsoft.com/office/word/2010/wordprocessingDrawing" xmlns:wp="http://schemas.openxmlformats.org/drawingml/2006/wordprocessingDrawing" xmlns:w10="urn:schemas-microsoft-com:office:word" xmlns:w="http://schemas.openxmlformats.org/wordprocessingml/2006/main" xmlns:w14="http://schemas.microsoft.com/office/word/2010/wordml" xmlns:w15="http://schemas.microsoft.com/office/word/2012/wordml" xmlns:w16cex="http://schemas.microsoft.com/office/word/2018/wordml/cex" xmlns:w16cid="http://schemas.microsoft.com/office/word/2016/wordml/cid" xmlns:w16="http://schemas.microsoft.com/office/word/2018/wordml" xmlns:w16du="http://schemas.microsoft.com/office/word/2023/wordml/word16du" xmlns:w16sdtdh="http://schemas.microsoft.com/office/word/2020/wordml/sdtdatahash" xmlns:w16se="http://schemas.microsoft.com/office/word/2015/wordml/symex" xmlns:wpg="http://schemas.microsoft.com/office/word/2010/wordprocessingGroup" xmlns:wpi="http://schemas.microsoft.com/office/word/2010/wordprocessingInk" xmlns:wne="http://schemas.microsoft.com/office/word/2006/wordml" xmlns:wps="http://schemas.microsoft.com/office/word/2010/wordprocessingShape" mc:Ignorable="w14 w15 w16se w16cid w16 w16cex w16sdtdh w16du wp14">
+<w:numbering xmlns:wpc="http://schemas.microsoft.com/office/word/2010/wordprocessingCanvas" xmlns:mc="http://schemas.openxmlformats.org/markup-compatibility/2006" xmlns:o="urn:schemas-microsoft-com:office:office" xmlns:r="http://schemas.openxmlformats.org/officeDocument/2006/relationships" xmlns:m="http://schemas.openxmlformats.org/officeDocument/2006/math" xmlns:v="urn:schemas-microsoft-com:vml" xmlns:wp14="http://schemas.microsoft.com/office/word/2010/wordprocessingDrawing" xmlns:wp="http://schemas.openxmlformats.org/drawingml/2006/wordprocessingDrawing" xmlns:w10="urn:schemas-microsoft-com:office:word" xmlns:w="http://schemas.openxmlformats.org/wordprocessingml/2006/main" xmlns:w14="http://schemas.microsoft.com/office/word/2010/wordml" xmlns:w15="http://schemas.microsoft.com/office/word/2012/wordml" xmlns:wpg="http://schemas.microsoft.com/office/word/2010/wordprocessingGroup" xmlns:wpi="http://schemas.microsoft.com/office/word/2010/wordprocessingInk" xmlns:wne="http://schemas.microsoft.com/office/word/2006/wordml" xmlns:wps="http://schemas.microsoft.com/office/word/2010/wordprocessingShape" mc:Ignorable="w14 w15 wp14">
   <w:abstractNum w:abstractNumId="0" w15:restartNumberingAfterBreak="0">
     <w:nsid w:val="04962BBC"/>
     <w:multiLevelType w:val="hybridMultilevel"/>
@@ -2404,29 +2360,29 @@
       </w:pPr>
     </w:lvl>
   </w:abstractNum>
-  <w:num w:numId="1" w16cid:durableId="1316226088">
+  <w:num w:numId="1">
     <w:abstractNumId w:val="3"/>
   </w:num>
-  <w:num w:numId="2" w16cid:durableId="1218273583">
+  <w:num w:numId="2">
     <w:abstractNumId w:val="2"/>
   </w:num>
-  <w:num w:numId="3" w16cid:durableId="15667018">
+  <w:num w:numId="3">
     <w:abstractNumId w:val="5"/>
   </w:num>
-  <w:num w:numId="4" w16cid:durableId="618413153">
+  <w:num w:numId="4">
     <w:abstractNumId w:val="4"/>
   </w:num>
-  <w:num w:numId="5" w16cid:durableId="769012562">
+  <w:num w:numId="5">
     <w:abstractNumId w:val="1"/>
   </w:num>
-  <w:num w:numId="6" w16cid:durableId="1381712336">
+  <w:num w:numId="6">
     <w:abstractNumId w:val="0"/>
   </w:num>
 </w:numbering>
 </file>
 
 <file path=word/styles.xml><?xml version="1.0" encoding="utf-8"?>
-<w:styles xmlns:mc="http://schemas.openxmlformats.org/markup-compatibility/2006" xmlns:r="http://schemas.openxmlformats.org/officeDocument/2006/relationships" xmlns:w="http://schemas.openxmlformats.org/wordprocessingml/2006/main" xmlns:w14="http://schemas.microsoft.com/office/word/2010/wordml" xmlns:w15="http://schemas.microsoft.com/office/word/2012/wordml" xmlns:w16cex="http://schemas.microsoft.com/office/word/2018/wordml/cex" xmlns:w16cid="http://schemas.microsoft.com/office/word/2016/wordml/cid" xmlns:w16="http://schemas.microsoft.com/office/word/2018/wordml" xmlns:w16du="http://schemas.microsoft.com/office/word/2023/wordml/word16du" xmlns:w16sdtdh="http://schemas.microsoft.com/office/word/2020/wordml/sdtdatahash" xmlns:w16se="http://schemas.microsoft.com/office/word/2015/wordml/symex" mc:Ignorable="w14 w15 w16se w16cid w16 w16cex w16sdtdh w16du">
+<w:styles xmlns:mc="http://schemas.openxmlformats.org/markup-compatibility/2006" xmlns:r="http://schemas.openxmlformats.org/officeDocument/2006/relationships" xmlns:w="http://schemas.openxmlformats.org/wordprocessingml/2006/main" xmlns:w14="http://schemas.microsoft.com/office/word/2010/wordml" xmlns:w15="http://schemas.microsoft.com/office/word/2012/wordml" mc:Ignorable="w14 w15">
   <w:docDefaults>
     <w:rPrDefault>
       <w:rPr>
@@ -2444,7 +2400,7 @@
       </w:pPr>
     </w:pPrDefault>
   </w:docDefaults>
-  <w:latentStyles w:defLockedState="0" w:defUIPriority="99" w:defSemiHidden="0" w:defUnhideWhenUsed="0" w:defQFormat="0" w:count="376">
+  <w:latentStyles w:defLockedState="0" w:defUIPriority="99" w:defSemiHidden="0" w:defUnhideWhenUsed="0" w:defQFormat="0" w:count="371">
     <w:lsdException w:name="Normal" w:uiPriority="0" w:qFormat="1"/>
     <w:lsdException w:name="heading 1" w:uiPriority="9" w:qFormat="1"/>
     <w:lsdException w:name="heading 2" w:semiHidden="1" w:uiPriority="9" w:unhideWhenUsed="1" w:qFormat="1"/>
@@ -2816,11 +2772,6 @@
     <w:lsdException w:name="List Table 5 Dark Accent 6" w:uiPriority="50"/>
     <w:lsdException w:name="List Table 6 Colorful Accent 6" w:uiPriority="51"/>
     <w:lsdException w:name="List Table 7 Colorful Accent 6" w:uiPriority="52"/>
-    <w:lsdException w:name="Mention" w:semiHidden="1" w:unhideWhenUsed="1"/>
-    <w:lsdException w:name="Smart Hyperlink" w:semiHidden="1" w:unhideWhenUsed="1"/>
-    <w:lsdException w:name="Hashtag" w:semiHidden="1" w:unhideWhenUsed="1"/>
-    <w:lsdException w:name="Unresolved Mention" w:semiHidden="1" w:unhideWhenUsed="1"/>
-    <w:lsdException w:name="Smart Link" w:semiHidden="1" w:unhideWhenUsed="1"/>
   </w:latentStyles>
   <w:style w:type="paragraph" w:default="1" w:styleId="Normal">
     <w:name w:val="Normal"/>

</xml_diff>